<commit_message>
Checkin before nested table
</commit_message>
<xml_diff>
--- a/createdByMixt.docx
+++ b/createdByMixt.docx
@@ -347,6 +347,9 @@
               <w:t xml:space="preserve"> </w:t>
             </w:r>
             <w:r>
+              <w:rPr>
+                <w:i/>
+              </w:rPr>
               <w:t>Part A - Overview.</w:t>
             </w:r>
           </w:p>
@@ -475,6 +478,9 @@
         <w:tc>
           <w:p>
             <w:r>
+              <w:rPr>
+                <w:b/>
+              </w:rPr>
               <w:t>CBPR+</w:t>
             </w:r>
             <w:r>
@@ -486,6 +492,9 @@
           </w:p>
           <w:p>
             <w:r>
+              <w:rPr>
+                <w:b/>
+              </w:rPr>
               <w:t>Customer credit transfer message</w:t>
             </w:r>
             <w:r>
@@ -508,6 +517,9 @@
           </w:p>
           <w:p>
             <w:r>
+              <w:rPr>
+                <w:b/>
+              </w:rPr>
               <w:t>Exception and investigation message</w:t>
             </w:r>
             <w:r>
@@ -585,6 +597,9 @@
           </w:p>
           <w:p>
             <w:r>
+              <w:rPr>
+                <w:b/>
+              </w:rPr>
               <w:t>FI credit transfer message</w:t>
             </w:r>
             <w:r>
@@ -618,6 +633,9 @@
           </w:p>
           <w:p>
             <w:r>
+              <w:rPr>
+                <w:b/>
+              </w:rPr>
               <w:t>FIN message</w:t>
             </w:r>
             <w:r>
@@ -629,6 +647,9 @@
           </w:p>
           <w:p>
             <w:r>
+              <w:rPr>
+                <w:b/>
+              </w:rPr>
               <w:t>MT message</w:t>
             </w:r>
             <w:r>
@@ -640,6 +661,9 @@
           </w:p>
           <w:p>
             <w:r>
+              <w:rPr>
+                <w:b/>
+              </w:rPr>
               <w:t>MX message</w:t>
             </w:r>
             <w:r>
@@ -651,6 +675,9 @@
           </w:p>
           <w:p>
             <w:r>
+              <w:rPr>
+                <w:b/>
+              </w:rPr>
               <w:t>MX Message Specifications</w:t>
             </w:r>
             <w:r>
@@ -662,6 +689,9 @@
           </w:p>
           <w:p>
             <w:r>
+              <w:rPr>
+                <w:b/>
+              </w:rPr>
               <w:t>Return message</w:t>
             </w:r>
             <w:r>
@@ -684,6 +714,9 @@
           </w:p>
           <w:p>
             <w:r>
+              <w:rPr>
+                <w:b/>
+              </w:rPr>
               <w:t>SWIFT message</w:t>
             </w:r>
             <w:r>
@@ -750,6 +783,9 @@
           </w:p>
           <w:p>
             <w:r>
+              <w:rPr>
+                <w:b/>
+              </w:rPr>
               <w:t>System message</w:t>
             </w:r>
             <w:r>

</xml_diff>